<commit_message>
feat: Updated SupportNova project
</commit_message>
<xml_diff>
--- a/sample_documents/PRV-POL-02_v1.0_customer-data-privacy-notice.docx
+++ b/sample_documents/PRV-POL-02_v1.0_customer-data-privacy-notice.docx
@@ -7,7 +7,7 @@
         <w:pStyle w:val="Title"/>
       </w:pPr>
       <w:r>
-        <w:t>NimbusCarta - Customer Data Privacy Notice</w:t>
+        <w:t>SupportNova - Customer Data Privacy Notice</w:t>
       </w:r>
     </w:p>
     <w:p>
@@ -60,7 +60,7 @@
     </w:p>
     <w:p>
       <w:r>
-        <w:t>NimbusCarta processes order and contact data only to fulfil orders and support requests.</w:t>
+        <w:t>SupportNova processes order and contact data only to fulfil orders and support requests.</w:t>
       </w:r>
     </w:p>
     <w:p>

</xml_diff>